<commit_message>
tarea s13 - cuarto test con POM + LoginPage extendida + cuenta del setup
</commit_message>
<xml_diff>
--- a/Respuesta Tarea-S12.docx
+++ b/Respuesta Tarea-S12.docx
@@ -1214,10 +1214,10 @@
         </w:rPr>
         <w:lastRenderedPageBreak/>
         <w:drawing>
-          <wp:inline distT="0" distB="0" distL="0" distR="0" wp14:anchorId="656E3B89" wp14:editId="3429CCDD">
-            <wp:extent cx="5612130" cy="3088640"/>
+          <wp:inline distT="0" distB="0" distL="0" distR="0" wp14:anchorId="10097E02" wp14:editId="1AECE75C">
+            <wp:extent cx="5612130" cy="3067050"/>
             <wp:effectExtent l="0" t="0" r="7620" b="0"/>
-            <wp:docPr id="17" name="Imagen 17"/>
+            <wp:docPr id="8" name="Imagen 8"/>
             <wp:cNvGraphicFramePr>
               <a:graphicFrameLocks xmlns:a="http://schemas.openxmlformats.org/drawingml/2006/main" noChangeAspect="1"/>
             </wp:cNvGraphicFramePr>
@@ -1237,7 +1237,7 @@
                   <pic:spPr>
                     <a:xfrm>
                       <a:off x="0" y="0"/>
-                      <a:ext cx="5612130" cy="3088640"/>
+                      <a:ext cx="5612130" cy="3067050"/>
                     </a:xfrm>
                     <a:prstGeom prst="rect">
                       <a:avLst/>
@@ -1258,8 +1258,57 @@
           <w:lang w:val="es-VE"/>
         </w:rPr>
       </w:pPr>
+      <w:r>
+        <w:rPr>
+          <w:noProof/>
+        </w:rPr>
+        <w:drawing>
+          <wp:inline distT="0" distB="0" distL="0" distR="0" wp14:anchorId="17787D85" wp14:editId="0D42F241">
+            <wp:extent cx="5612130" cy="2839085"/>
+            <wp:effectExtent l="0" t="0" r="7620" b="0"/>
+            <wp:docPr id="7" name="Imagen 7"/>
+            <wp:cNvGraphicFramePr>
+              <a:graphicFrameLocks xmlns:a="http://schemas.openxmlformats.org/drawingml/2006/main" noChangeAspect="1"/>
+            </wp:cNvGraphicFramePr>
+            <a:graphic xmlns:a="http://schemas.openxmlformats.org/drawingml/2006/main">
+              <a:graphicData uri="http://schemas.openxmlformats.org/drawingml/2006/picture">
+                <pic:pic xmlns:pic="http://schemas.openxmlformats.org/drawingml/2006/picture">
+                  <pic:nvPicPr>
+                    <pic:cNvPr id="1" name=""/>
+                    <pic:cNvPicPr/>
+                  </pic:nvPicPr>
+                  <pic:blipFill>
+                    <a:blip r:embed="rId18"/>
+                    <a:stretch>
+                      <a:fillRect/>
+                    </a:stretch>
+                  </pic:blipFill>
+                  <pic:spPr>
+                    <a:xfrm>
+                      <a:off x="0" y="0"/>
+                      <a:ext cx="5612130" cy="2839085"/>
+                    </a:xfrm>
+                    <a:prstGeom prst="rect">
+                      <a:avLst/>
+                    </a:prstGeom>
+                  </pic:spPr>
+                </pic:pic>
+              </a:graphicData>
+            </a:graphic>
+          </wp:inline>
+        </w:drawing>
+      </w:r>
       <w:bookmarkStart w:id="0" w:name="_GoBack"/>
       <w:bookmarkEnd w:id="0"/>
+    </w:p>
+    <w:p>
+      <w:pPr>
+        <w:rPr>
+          <w:b/>
+          <w:color w:val="000099"/>
+          <w:lang w:val="es-VE"/>
+        </w:rPr>
+      </w:pPr>
     </w:p>
     <w:p>
       <w:pPr>

</xml_diff>